<commit_message>
docs: rebuild 3 resumes faithful to original PDF (black=fact/yellow=focus/blue=supplement+appendix)
</commit_message>
<xml_diff>
--- a/02-Knowledge/career-development/interview-project-summaries/01-company-interviews/韩伟-简历-V1-MCU-DSP-RTOS.docx
+++ b/02-Knowledge/career-development/interview-project-summaries/01-company-interviews/韩伟-简历-V1-MCU-DSP-RTOS.docx
@@ -42,6 +42,45 @@
           <w:sz w:val="21"/>
         </w:rPr>
         <w:t>求职意向：高级嵌入式软件工程师（MCU / DSP 底层 + RTOS 内核方向）  |  期望城市：北京</w:t>
+      </w:r>
+    </w:p>
+    <w:p>
+      <w:pPr>
+        <w:spacing w:after="120"/>
+      </w:pPr>
+      <w:r>
+        <w:rPr>
+          <w:rFonts w:ascii="Arial" w:hAnsi="Arial" w:eastAsia="微软雅黑"/>
+          <w:b w:val="0"/>
+          <w:sz w:val="17"/>
+        </w:rPr>
+        <w:t>图例：</w:t>
+      </w:r>
+      <w:r>
+        <w:rPr>
+          <w:rFonts w:ascii="Arial" w:hAnsi="Arial" w:eastAsia="微软雅黑"/>
+          <w:b w:val="0"/>
+          <w:sz w:val="17"/>
+        </w:rPr>
+        <w:t xml:space="preserve">黑色=原简历事实 </w:t>
+      </w:r>
+      <w:r>
+        <w:rPr>
+          <w:rFonts w:ascii="Arial" w:hAnsi="Arial" w:eastAsia="微软雅黑"/>
+          <w:b w:val="0"/>
+          <w:sz w:val="17"/>
+          <w:highlight w:val="yellow"/>
+        </w:rPr>
+        <w:t xml:space="preserve">黄色高亮=方向重点 </w:t>
+      </w:r>
+      <w:r>
+        <w:rPr>
+          <w:rFonts w:ascii="Arial" w:hAnsi="Arial" w:eastAsia="微软雅黑"/>
+          <w:b w:val="0"/>
+          <w:color w:val="0070C0"/>
+          <w:sz w:val="17"/>
+        </w:rPr>
+        <w:t>蓝色=优化补充(请核对)</w:t>
       </w:r>
     </w:p>
     <w:p>
@@ -119,7 +158,7 @@
           <w:b w:val="0"/>
           <w:sz w:val="21"/>
         </w:rPr>
-        <w:t>，资源占用优于 µC/OS 与 FreeRTOS，支撑百万台量产设备。</w:t>
+        <w:t>，优于 µC/OS 与 FreeRTOS，百万台量产。</w:t>
       </w:r>
     </w:p>
     <w:p>
@@ -155,10 +194,10 @@
         <w:rPr>
           <w:rFonts w:ascii="Arial" w:hAnsi="Arial" w:eastAsia="微软雅黑"/>
           <w:b w:val="0"/>
+          <w:color w:val="0070C0"/>
           <w:sz w:val="21"/>
-          <w:highlight w:val="yellow"/>
         </w:rPr>
-        <w:t>FFT 谐波分析、闪变测量（IEC 61000-4-15 标准 IIR 滤波器组）、工频提取、插值重采样</w:t>
+        <w:t>FFT 谐波分析、闪变测量（IEC 61000-4-15）、工频提取、插值重采样</w:t>
       </w:r>
       <w:r>
         <w:rPr>
@@ -172,8 +211,8 @@
         <w:rPr>
           <w:rFonts w:ascii="Arial" w:hAnsi="Arial" w:eastAsia="微软雅黑"/>
           <w:b w:val="0"/>
+          <w:color w:val="0070C0"/>
           <w:sz w:val="21"/>
-          <w:highlight w:val="yellow"/>
         </w:rPr>
         <w:t>SHARC 硬件 FIR/IIR/FFT 加速器 + 汇编优化 + Cache 优化</w:t>
       </w:r>
@@ -230,7 +269,7 @@
           <w:b w:val="0"/>
           <w:sz w:val="21"/>
         </w:rPr>
-        <w:t>，多通道 ADC 采样抖动 ±15us→±2us。</w:t>
+        <w:t>，采样抖动降 90%。</w:t>
       </w:r>
     </w:p>
     <w:p>
@@ -260,7 +299,7 @@
           <w:b w:val="0"/>
           <w:sz w:val="21"/>
         </w:rPr>
-        <w:t>：百万级量产经验，直管 5 人软件团队，IPD 产品开发流程。</w:t>
+        <w:t>：百万级量产经验，直管 5 人软件团队，IPD 流程。</w:t>
       </w:r>
     </w:p>
     <w:p>
@@ -309,23 +348,7 @@
           <w:b w:val="0"/>
           <w:sz w:val="21"/>
         </w:rPr>
-        <w:t xml:space="preserve">• </w:t>
-      </w:r>
-      <w:r>
-        <w:rPr>
-          <w:rFonts w:ascii="Arial" w:hAnsi="Arial" w:eastAsia="微软雅黑"/>
-          <w:b/>
-          <w:sz w:val="21"/>
-        </w:rPr>
-        <w:t>技术开发</w:t>
-      </w:r>
-      <w:r>
-        <w:rPr>
-          <w:rFonts w:ascii="Arial" w:hAnsi="Arial" w:eastAsia="微软雅黑"/>
-          <w:b w:val="0"/>
-          <w:sz w:val="21"/>
-        </w:rPr>
-        <w:t>：独立完成 Realtek MAC + C51 低成本交换机平台从零搭建（Bootloader/底层驱动/OTA/量产方案），整机成本较上代下降 30%。</w:t>
+        <w:t>• 独立完成 Realtek MAC + C51 低成本交换机平台从零搭建（底层驱动/BOOT/APP 量产方案/业务平台），整机降本 30%。</w:t>
       </w:r>
     </w:p>
     <w:p>
@@ -339,23 +362,7 @@
           <w:b w:val="0"/>
           <w:sz w:val="21"/>
         </w:rPr>
-        <w:t xml:space="preserve">• </w:t>
-      </w:r>
-      <w:r>
-        <w:rPr>
-          <w:rFonts w:ascii="Arial" w:hAnsi="Arial" w:eastAsia="微软雅黑"/>
-          <w:b/>
-          <w:sz w:val="21"/>
-        </w:rPr>
-        <w:t>项目管理</w:t>
-      </w:r>
-      <w:r>
-        <w:rPr>
-          <w:rFonts w:ascii="Arial" w:hAnsi="Arial" w:eastAsia="微软雅黑"/>
-          <w:b w:val="0"/>
-          <w:sz w:val="21"/>
-        </w:rPr>
-        <w:t>：担任 PL 直管 5 人软件团队，统筹 TSN 交换机等重点项目交付，培养 3 名骨干工程师。</w:t>
+        <w:t>• 担任 PL 直管 5 人软件团队，统筹 TSN 交换机等重点项目交付，培养 3 名骨干工程师。</w:t>
       </w:r>
     </w:p>
     <w:p>
@@ -390,40 +397,7 @@
           <w:b w:val="0"/>
           <w:sz w:val="21"/>
         </w:rPr>
-        <w:t xml:space="preserve">• </w:t>
-      </w:r>
-      <w:r>
-        <w:rPr>
-          <w:rFonts w:ascii="Arial" w:hAnsi="Arial" w:eastAsia="微软雅黑"/>
-          <w:b/>
-          <w:sz w:val="21"/>
-        </w:rPr>
-        <w:t>技术开发</w:t>
-      </w:r>
-      <w:r>
-        <w:rPr>
-          <w:rFonts w:ascii="Arial" w:hAnsi="Arial" w:eastAsia="微软雅黑"/>
-          <w:b w:val="0"/>
-          <w:sz w:val="21"/>
-        </w:rPr>
-        <w:t>：</w:t>
-      </w:r>
-      <w:r>
-        <w:rPr>
-          <w:rFonts w:ascii="Arial" w:hAnsi="Arial" w:eastAsia="微软雅黑"/>
-          <w:b w:val="0"/>
-          <w:sz w:val="21"/>
-          <w:highlight w:val="yellow"/>
-        </w:rPr>
-        <w:t>从零自研 RTOS 内核</w:t>
-      </w:r>
-      <w:r>
-        <w:rPr>
-          <w:rFonts w:ascii="Arial" w:hAnsi="Arial" w:eastAsia="微软雅黑"/>
-          <w:b w:val="0"/>
-          <w:sz w:val="21"/>
-        </w:rPr>
-        <w:t>，搭建 ARM / DSP 产品软件底座，支撑电力监控仪表、电能质量分析仪系列产品。</w:t>
+        <w:t>• 从零自研 RTOS 内核，搭建 ARM / DSP 产品软件底座，支撑电力监控仪表、电能质量分析仪系列产品。</w:t>
       </w:r>
     </w:p>
     <w:p>
@@ -437,23 +411,7 @@
           <w:b w:val="0"/>
           <w:sz w:val="21"/>
         </w:rPr>
-        <w:t xml:space="preserve">• </w:t>
-      </w:r>
-      <w:r>
-        <w:rPr>
-          <w:rFonts w:ascii="Arial" w:hAnsi="Arial" w:eastAsia="微软雅黑"/>
-          <w:b/>
-          <w:sz w:val="21"/>
-        </w:rPr>
-        <w:t>项目交付</w:t>
-      </w:r>
-      <w:r>
-        <w:rPr>
-          <w:rFonts w:ascii="Arial" w:hAnsi="Arial" w:eastAsia="微软雅黑"/>
-          <w:b w:val="0"/>
-          <w:sz w:val="21"/>
-        </w:rPr>
-        <w:t>：主导多个中高端电力仪表项目交付；参与部门研发流程体系建设，获 2019 年度优秀员工。</w:t>
+        <w:t>• 主导多个中高端电力仪表项目交付；参与部门研发流程体系建设，获 2019 年度优秀员工。</w:t>
       </w:r>
     </w:p>
     <w:p>
@@ -480,7 +438,7 @@
           <w:b/>
           <w:sz w:val="22"/>
         </w:rPr>
-        <w:t>DSP 产品平台开发（自研 RTOS + DSP 优化）｜北京爱博精电｜2023.01 - 2023.03</w:t>
+        <w:t>DSP 产品平台开发｜北京爱博精电｜2023.01 - 2023.03</w:t>
       </w:r>
     </w:p>
     <w:p>
@@ -494,7 +452,7 @@
           <w:b w:val="0"/>
           <w:sz w:val="21"/>
         </w:rPr>
-        <w:t>• 将 FFT、均方根、滤波、插值等信号处理算法平台化，汇编指令优化 + 硬件加速器（FIR/IIR/FFT），供多项目复用。</w:t>
+        <w:t>• FFT、均方根、滤波、插值等信号处理算法平台化，汇编指令优化 + 硬件加速器（FIR/IIR/FFT），供多项目复用。</w:t>
       </w:r>
     </w:p>
     <w:p>
@@ -517,7 +475,7 @@
           <w:sz w:val="21"/>
           <w:highlight w:val="yellow"/>
         </w:rPr>
-        <w:t>整体性能提升 40%</w:t>
+        <w:t>性能提升 40%</w:t>
       </w:r>
       <w:r>
         <w:rPr>
@@ -548,24 +506,7 @@
           <w:sz w:val="21"/>
           <w:highlight w:val="yellow"/>
         </w:rPr>
-        <w:t>从零实现自研 RTOS 内核</w:t>
-      </w:r>
-      <w:r>
-        <w:rPr>
-          <w:rFonts w:ascii="Arial" w:hAnsi="Arial" w:eastAsia="微软雅黑"/>
-          <w:b w:val="0"/>
-          <w:sz w:val="21"/>
-        </w:rPr>
-        <w:t>（任务调度/优先级管理/信号量/中断处理），</w:t>
-      </w:r>
-      <w:r>
-        <w:rPr>
-          <w:rFonts w:ascii="Arial" w:hAnsi="Arial" w:eastAsia="微软雅黑"/>
-          <w:b w:val="0"/>
-          <w:sz w:val="21"/>
-          <w:highlight w:val="yellow"/>
-        </w:rPr>
-        <w:t>内核 ROM 5KB、零任务 RAM 1.5KB</w:t>
+        <w:t>实现自研 RTOS 产品平台（任务调度/优先级/信号量/中断处理），内核 ROM 5KB、零任务 RAM 1.5KB</w:t>
       </w:r>
       <w:r>
         <w:rPr>
@@ -586,7 +527,7 @@
           <w:b/>
           <w:sz w:val="22"/>
         </w:rPr>
-        <w:t>高端电能质量分析仪（DSP 信号处理 · 核心项目）｜北京爱博精电｜2020.08 - 2022.12</w:t>
+        <w:t>高端电能质量分析仪｜北京爱博精电｜2020.08 - 2022.12</w:t>
       </w:r>
     </w:p>
     <w:p>
@@ -600,7 +541,21 @@
           <w:b w:val="0"/>
           <w:sz w:val="20"/>
         </w:rPr>
-        <w:t>平台：ADI SC573（ARM Cortex-A5 + 双 SHARC DSP，AMP 异构），DSP 运行自研 RTOS、A5 运行 Linux</w:t>
+        <w:t>平台：ADI SC573（双 SHARC DSP + ARM Cortex-A5 异构），DSP 运行 RTOS、A5 运行 Linux</w:t>
+      </w:r>
+    </w:p>
+    <w:p>
+      <w:pPr>
+        <w:spacing w:before="0" w:after="40"/>
+        <w:ind w:left="461"/>
+      </w:pPr>
+      <w:r>
+        <w:rPr>
+          <w:rFonts w:ascii="Arial" w:hAnsi="Arial" w:eastAsia="微软雅黑"/>
+          <w:b w:val="0"/>
+          <w:sz w:val="21"/>
+        </w:rPr>
+        <w:t>• 负责 DSP 驱动开发、RTOS 移植、计量算法实现、应用功能设计；实现电参量计量、电能质量分析、实时监控，接入 Modbus / CAN / IEC 61850 电网标准协议。</w:t>
       </w:r>
     </w:p>
     <w:p>
@@ -636,10 +591,10 @@
         <w:rPr>
           <w:rFonts w:ascii="Arial" w:hAnsi="Arial" w:eastAsia="微软雅黑"/>
           <w:b w:val="0"/>
+          <w:color w:val="0070C0"/>
           <w:sz w:val="21"/>
-          <w:highlight w:val="yellow"/>
         </w:rPr>
-        <w:t>FFT 谐波分析（Hanning 加窗防频谱泄漏）、闪变测量（IEC 61000-4-15 标准 IIR 滤波器组）、工频提取、插值重采样</w:t>
+        <w:t>FFT 谐波分析、闪变测量（IEC 61000-4-15 标准 IIR 滤波器组）、工频提取、插值重采样</w:t>
       </w:r>
       <w:r>
         <w:rPr>
@@ -647,7 +602,24 @@
           <w:b w:val="0"/>
           <w:sz w:val="21"/>
         </w:rPr>
-        <w:t>，满足 0.1 级电压电流测量精度。</w:t>
+        <w:t>，</w:t>
+      </w:r>
+      <w:r>
+        <w:rPr>
+          <w:rFonts w:ascii="Arial" w:hAnsi="Arial" w:eastAsia="微软雅黑"/>
+          <w:b w:val="0"/>
+          <w:color w:val="0070C0"/>
+          <w:sz w:val="21"/>
+        </w:rPr>
+        <w:t>满足 0.1 级电压电流测量精度</w:t>
+      </w:r>
+      <w:r>
+        <w:rPr>
+          <w:rFonts w:ascii="Arial" w:hAnsi="Arial" w:eastAsia="微软雅黑"/>
+          <w:b w:val="0"/>
+          <w:sz w:val="21"/>
+        </w:rPr>
+        <w:t>。</w:t>
       </w:r>
     </w:p>
     <w:p>
@@ -683,27 +655,10 @@
         <w:rPr>
           <w:rFonts w:ascii="Arial" w:hAnsi="Arial" w:eastAsia="微软雅黑"/>
           <w:b w:val="0"/>
-          <w:sz w:val="21"/>
-          <w:highlight w:val="yellow"/>
-        </w:rPr>
-        <w:t>SHARC 硬件 FIR/IIR/FFT 加速器（单周期 MAC + DAG 循环缓冲）+ 汇编优化</w:t>
-      </w:r>
-      <w:r>
-        <w:rPr>
-          <w:rFonts w:ascii="Arial" w:hAnsi="Arial" w:eastAsia="微软雅黑"/>
-          <w:b w:val="0"/>
+          <w:color w:val="0070C0"/>
           <w:sz w:val="21"/>
         </w:rPr>
-        <w:t>；定位并解决双核伪共享（64 字节对齐），</w:t>
-      </w:r>
-      <w:r>
-        <w:rPr>
-          <w:rFonts w:ascii="Arial" w:hAnsi="Arial" w:eastAsia="微软雅黑"/>
-          <w:b w:val="0"/>
-          <w:sz w:val="21"/>
-          <w:highlight w:val="yellow"/>
-        </w:rPr>
-        <w:t>性能提升 40%</w:t>
+        <w:t>SHARC 硬件 FIR/IIR/FFT 加速器、汇编优化；解决双核伪共享（64 字节对齐），性能提升 40%</w:t>
       </w:r>
       <w:r>
         <w:rPr>
@@ -725,23 +680,7 @@
           <w:b w:val="0"/>
           <w:sz w:val="21"/>
         </w:rPr>
-        <w:t xml:space="preserve">• </w:t>
-      </w:r>
-      <w:r>
-        <w:rPr>
-          <w:rFonts w:ascii="Arial" w:hAnsi="Arial" w:eastAsia="微软雅黑"/>
-          <w:b/>
-          <w:sz w:val="21"/>
-        </w:rPr>
-        <w:t>高精度采样</w:t>
-      </w:r>
-      <w:r>
-        <w:rPr>
-          <w:rFonts w:ascii="Arial" w:hAnsi="Arial" w:eastAsia="微软雅黑"/>
-          <w:b w:val="0"/>
-          <w:sz w:val="21"/>
-        </w:rPr>
-        <w:t>：多通道 ADC + DMA 双缓冲 + 三级优先级调度，</w:t>
+        <w:t>• 高精度采样：多通道 ADC + DMA 双缓冲 + 三级优先级调度，</w:t>
       </w:r>
       <w:r>
         <w:rPr>
@@ -750,7 +689,7 @@
           <w:sz w:val="21"/>
           <w:highlight w:val="yellow"/>
         </w:rPr>
-        <w:t>采样抖动 ±15us→±2us（降 90%）</w:t>
+        <w:t>采样抖动降低 90%</w:t>
       </w:r>
       <w:r>
         <w:rPr>
@@ -772,15 +711,16 @@
           <w:b w:val="0"/>
           <w:sz w:val="21"/>
         </w:rPr>
-        <w:t xml:space="preserve">• </w:t>
+        <w:t>• 异构通信：中断驱动 + 共享内存双核通信机制，</w:t>
       </w:r>
       <w:r>
         <w:rPr>
           <w:rFonts w:ascii="Arial" w:hAnsi="Arial" w:eastAsia="微软雅黑"/>
-          <w:b/>
+          <w:b w:val="0"/>
           <w:sz w:val="21"/>
+          <w:highlight w:val="yellow"/>
         </w:rPr>
-        <w:t>异构通信</w:t>
+        <w:t>跨核通信周期 ≤10ms</w:t>
       </w:r>
       <w:r>
         <w:rPr>
@@ -788,7 +728,7 @@
           <w:b w:val="0"/>
           <w:sz w:val="21"/>
         </w:rPr>
-        <w:t>：中断驱动 + 共享内存双核通信机制，跨核通信周期 ≤10ms；接入 Modbus / CAN / IEC 61850。</w:t>
+        <w:t>；搭建从需求分析到集成测试的完整流程体系。</w:t>
       </w:r>
     </w:p>
     <w:p>
@@ -829,23 +769,7 @@
           <w:b w:val="0"/>
           <w:sz w:val="21"/>
         </w:rPr>
-        <w:t xml:space="preserve">• </w:t>
-      </w:r>
-      <w:r>
-        <w:rPr>
-          <w:rFonts w:ascii="Arial" w:hAnsi="Arial" w:eastAsia="微软雅黑"/>
-          <w:b/>
-          <w:sz w:val="21"/>
-        </w:rPr>
-        <w:t>性能优化</w:t>
-      </w:r>
-      <w:r>
-        <w:rPr>
-          <w:rFonts w:ascii="Arial" w:hAnsi="Arial" w:eastAsia="微软雅黑"/>
-          <w:b w:val="0"/>
-          <w:sz w:val="21"/>
-        </w:rPr>
-        <w:t>：DMA 链式传输替代 CPU 轮询，</w:t>
+        <w:t>• 性能优化：DMA 链式传输替代 CPU 轮询，</w:t>
       </w:r>
       <w:r>
         <w:rPr>
@@ -903,37 +827,7 @@
           <w:b w:val="0"/>
           <w:sz w:val="20"/>
         </w:rPr>
-        <w:t>平台：Marvell DX1516M + PHY，Linux 系统</w:t>
-      </w:r>
-    </w:p>
-    <w:p>
-      <w:pPr>
-        <w:spacing w:before="0" w:after="40"/>
-        <w:ind w:left="461"/>
-      </w:pPr>
-      <w:r>
-        <w:rPr>
-          <w:rFonts w:ascii="Arial" w:hAnsi="Arial" w:eastAsia="微软雅黑"/>
-          <w:b w:val="0"/>
-          <w:sz w:val="21"/>
-        </w:rPr>
-        <w:t xml:space="preserve">• </w:t>
-      </w:r>
-      <w:r>
-        <w:rPr>
-          <w:rFonts w:ascii="Arial" w:hAnsi="Arial" w:eastAsia="微软雅黑"/>
-          <w:b/>
-          <w:sz w:val="21"/>
-        </w:rPr>
-        <w:t>角色</w:t>
-      </w:r>
-      <w:r>
-        <w:rPr>
-          <w:rFonts w:ascii="Arial" w:hAnsi="Arial" w:eastAsia="微软雅黑"/>
-          <w:b w:val="0"/>
-          <w:sz w:val="21"/>
-        </w:rPr>
-        <w:t>：高级嵌入式软件工程师 / PL，负责底层驱动 + 集成（TSN 协议栈核心由驱动/平台团队负责）。</w:t>
+        <w:t>平台：Marvell DX1516M + PHY 88E1781/88E1786，Linux 系统</w:t>
       </w:r>
     </w:p>
     <w:p>
@@ -983,6 +877,37 @@
     </w:p>
     <w:p>
       <w:pPr>
+        <w:spacing w:before="0" w:after="40"/>
+        <w:ind w:left="461"/>
+      </w:pPr>
+      <w:r>
+        <w:rPr>
+          <w:rFonts w:ascii="Arial" w:hAnsi="Arial" w:eastAsia="微软雅黑"/>
+          <w:b w:val="0"/>
+          <w:sz w:val="21"/>
+        </w:rPr>
+        <w:t xml:space="preserve">• </w:t>
+      </w:r>
+      <w:r>
+        <w:rPr>
+          <w:rFonts w:ascii="Arial" w:hAnsi="Arial" w:eastAsia="微软雅黑"/>
+          <w:b w:val="0"/>
+          <w:color w:val="0070C0"/>
+          <w:sz w:val="21"/>
+        </w:rPr>
+        <w:t>角色：负责底层驱动 + 集成，TSN 协议栈核心由驱动/平台团队负责</w:t>
+      </w:r>
+      <w:r>
+        <w:rPr>
+          <w:rFonts w:ascii="Arial" w:hAnsi="Arial" w:eastAsia="微软雅黑"/>
+          <w:b w:val="0"/>
+          <w:sz w:val="21"/>
+        </w:rPr>
+        <w:t>。担任项目 PL，统筹软件团队推进交付。</w:t>
+      </w:r>
+    </w:p>
+    <w:p>
+      <w:pPr>
         <w:spacing w:before="120" w:after="20"/>
       </w:pPr>
       <w:r>
@@ -1019,7 +944,7 @@
           <w:b w:val="0"/>
           <w:sz w:val="21"/>
         </w:rPr>
-        <w:t>• 独立完成新平台从零搭建：底层驱动 → Bootloader → 量产方案 → OTA → 业务平台。</w:t>
+        <w:t>• 独立完成新平台从零搭建：底层驱动 → BOOT → APP 量产方案 → OTA → 业务平台。</w:t>
       </w:r>
     </w:p>
     <w:p>
@@ -1050,7 +975,21 @@
           <w:b w:val="0"/>
           <w:sz w:val="21"/>
         </w:rPr>
-        <w:t>，新增 WEB 管理、云端纳管（CoAP/M2M）功能，量产上市。</w:t>
+        <w:t>，功能更全面（本地 WEB 管理 + 云端纳管 CoAP/M2M），量产上市。</w:t>
+      </w:r>
+    </w:p>
+    <w:p>
+      <w:pPr>
+        <w:spacing w:before="0" w:after="40"/>
+        <w:ind w:left="461"/>
+      </w:pPr>
+      <w:r>
+        <w:rPr>
+          <w:rFonts w:ascii="Arial" w:hAnsi="Arial" w:eastAsia="微软雅黑"/>
+          <w:b w:val="0"/>
+          <w:sz w:val="21"/>
+        </w:rPr>
+        <w:t>• 带领团队搭建基于 FreeRTOS 的标准化产品平台，提升复用效率。</w:t>
       </w:r>
     </w:p>
     <w:p>
@@ -1114,6 +1053,67 @@
           <w:sz w:val="21"/>
         </w:rPr>
         <w:t>• 全国大学生数学建模竞赛 国家二等奖</w:t>
+      </w:r>
+    </w:p>
+    <w:p>
+      <w:r>
+        <w:br w:type="page"/>
+      </w:r>
+    </w:p>
+    <w:p>
+      <w:pPr>
+        <w:spacing w:before="0" w:after="80"/>
+      </w:pPr>
+      <w:r>
+        <w:rPr>
+          <w:rFonts w:ascii="Arial" w:hAnsi="Arial" w:eastAsia="微软雅黑"/>
+          <w:b/>
+          <w:color w:val="C00000"/>
+          <w:sz w:val="22"/>
+        </w:rPr>
+        <w:t>附录：补充内容核对清单（蓝色字 = 我在原简历基础上补充/优化的，请逐条核对；投递前删除本页）</w:t>
+      </w:r>
+    </w:p>
+    <w:p>
+      <w:pPr>
+        <w:spacing w:before="0" w:after="40"/>
+        <w:ind w:left="259"/>
+      </w:pPr>
+      <w:r>
+        <w:rPr>
+          <w:rFonts w:ascii="Arial" w:hAnsi="Arial" w:eastAsia="微软雅黑"/>
+          <w:b w:val="0"/>
+          <w:sz w:val="19"/>
+        </w:rPr>
+        <w:t>• 电能质量分析仪「FFT 谐波分析/闪变测量/工频提取/插值重采样/SHARC 加速器/伪共享 40%/0.1 级精度」：原简历写在 DSP 平台项目，经你确认（2026-09-24）也是电能质量分析仪项目所做，故归入此项目。</w:t>
+      </w:r>
+    </w:p>
+    <w:p>
+      <w:pPr>
+        <w:spacing w:before="0" w:after="40"/>
+        <w:ind w:left="259"/>
+      </w:pPr>
+      <w:r>
+        <w:rPr>
+          <w:rFonts w:ascii="Arial" w:hAnsi="Arial" w:eastAsia="微软雅黑"/>
+          <w:b w:val="0"/>
+          <w:sz w:val="19"/>
+        </w:rPr>
+        <w:t>• TSN「协议栈核心由驱动/平台团队负责」：角色澄清，避免被当成 TSN 协议栈专家深挖（TSN 为产品集成，非协议栈主力）。</w:t>
+      </w:r>
+    </w:p>
+    <w:p>
+      <w:pPr>
+        <w:spacing w:before="0" w:after="40"/>
+        <w:ind w:left="259"/>
+      </w:pPr>
+      <w:r>
+        <w:rPr>
+          <w:rFonts w:ascii="Arial" w:hAnsi="Arial" w:eastAsia="微软雅黑"/>
+          <w:b w:val="0"/>
+          <w:sz w:val="19"/>
+        </w:rPr>
+        <w:t>• 删除原简历「界面显示/网页显示/生成报表/数据导出」等功能罗列（非核心技术，堆砌）。</w:t>
       </w:r>
     </w:p>
     <w:sectPr>

</xml_diff>